<commit_message>
Restyle both resumes using the supplied orange portrait template
</commit_message>
<xml_diff>
--- a/downloads/李佳乐_beU_RPA自动化实习_投递简历.docx
+++ b/downloads/李佳乐_beU_RPA自动化实习_投递简历.docx
@@ -2,80 +2,291 @@
 <file path=word/document.xml><?xml version="1.0" encoding="utf-8"?>
 <w:document xmlns:wpc="http://schemas.microsoft.com/office/word/2010/wordprocessingCanvas" xmlns:mo="http://schemas.microsoft.com/office/mac/office/2008/main" xmlns:mc="http://schemas.openxmlformats.org/markup-compatibility/2006" xmlns:mv="urn:schemas-microsoft-com:mac:vml" xmlns:o="urn:schemas-microsoft-com:office:office" xmlns:r="http://schemas.openxmlformats.org/officeDocument/2006/relationships" xmlns:m="http://schemas.openxmlformats.org/officeDocument/2006/math" xmlns:v="urn:schemas-microsoft-com:vml" xmlns:wp14="http://schemas.microsoft.com/office/word/2010/wordprocessingDrawing" xmlns:wp="http://schemas.openxmlformats.org/drawingml/2006/wordprocessingDrawing" xmlns:w10="urn:schemas-microsoft-com:office:word" xmlns:w="http://schemas.openxmlformats.org/wordprocessingml/2006/main" xmlns:w14="http://schemas.microsoft.com/office/word/2010/wordml" xmlns:wpg="http://schemas.microsoft.com/office/word/2010/wordprocessingGroup" xmlns:wpi="http://schemas.microsoft.com/office/word/2010/wordprocessingInk" xmlns:wne="http://schemas.microsoft.com/office/word/2006/wordml" xmlns:wps="http://schemas.microsoft.com/office/word/2010/wordprocessingShape" mc:Ignorable="w14 wp14">
   <w:body>
+    <w:tbl>
+      <w:tblPr>
+        <w:tblW w:type="auto" w:w="0"/>
+        <w:jc w:val="center"/>
+        <w:tblLayout w:type="fixed"/>
+        <w:tblLook w:firstColumn="1" w:firstRow="1" w:lastColumn="0" w:lastRow="0" w:noHBand="0" w:noVBand="1" w:val="04A0"/>
+      </w:tblPr>
+      <w:tblGrid>
+        <w:gridCol w:w="9071"/>
+        <w:gridCol w:w="1531"/>
+      </w:tblGrid>
+      <w:tr>
+        <w:tc>
+          <w:tcPr>
+            <w:tcW w:type="dxa" w:w="9071"/>
+            <w:vAlign w:val="center"/>
+            <w:tcMar>
+              <w:top w:w="0" w:type="dxa"/>
+              <w:bottom w:w="0" w:type="dxa"/>
+              <w:left w:w="0" w:type="dxa"/>
+              <w:right w:w="0" w:type="dxa"/>
+            </w:tcMar>
+          </w:tcPr>
+          <w:p>
+            <w:pPr>
+              <w:pStyle w:val="Title"/>
+              <w:spacing w:before="0" w:after="100" w:line="460" w:lineRule="exact"/>
+              <w:jc w:val="center"/>
+            </w:pPr>
+            <w:r>
+              <w:rPr>
+                <w:rFonts w:ascii="Microsoft YaHei" w:hAnsi="Microsoft YaHei" w:eastAsia="Microsoft YaHei"/>
+                <w:b/>
+                <w:i w:val="0"/>
+                <w:color w:val="C2410C"/>
+                <w:sz w:val="37"/>
+              </w:rPr>
+              <w:t>李 佳 乐</w:t>
+            </w:r>
+          </w:p>
+          <w:p>
+            <w:pPr>
+              <w:spacing w:after="24" w:line="224" w:lineRule="exact"/>
+              <w:jc w:val="center"/>
+            </w:pPr>
+            <w:r>
+              <w:rPr>
+                <w:rFonts w:ascii="Microsoft YaHei" w:hAnsi="Microsoft YaHei" w:eastAsia="Microsoft YaHei"/>
+                <w:b/>
+                <w:i w:val="0"/>
+                <w:color w:val="334155"/>
+                <w:sz w:val="17"/>
+              </w:rPr>
+              <w:t>求职意向：beU RPA 自动化开发实习生  |  电子信息硕士在读</w:t>
+            </w:r>
+          </w:p>
+          <w:p>
+            <w:pPr>
+              <w:spacing w:after="24" w:line="224" w:lineRule="exact"/>
+              <w:jc w:val="center"/>
+            </w:pPr>
+            <w:r>
+              <w:rPr>
+                <w:rFonts w:ascii="Microsoft YaHei" w:hAnsi="Microsoft YaHei" w:eastAsia="Microsoft YaHei"/>
+                <w:b w:val="0"/>
+                <w:i w:val="0"/>
+                <w:color w:val="64748B"/>
+                <w:sz w:val="16"/>
+              </w:rPr>
+              <w:t>178-5411-9096  |  17854119096@163.com</w:t>
+            </w:r>
+          </w:p>
+          <w:p>
+            <w:pPr>
+              <w:spacing w:after="24" w:line="224" w:lineRule="exact"/>
+              <w:jc w:val="center"/>
+            </w:pPr>
+            <w:r>
+              <w:rPr>
+                <w:rFonts w:ascii="Microsoft YaHei" w:hAnsi="Microsoft YaHei" w:eastAsia="Microsoft YaHei"/>
+                <w:b w:val="0"/>
+                <w:i w:val="0"/>
+                <w:color w:val="64748B"/>
+                <w:sz w:val="16"/>
+              </w:rPr>
+              <w:t>作品集：https://lijiale-embed.github.io/</w:t>
+            </w:r>
+          </w:p>
+          <w:p>
+            <w:pPr>
+              <w:spacing w:after="24" w:line="224" w:lineRule="exact"/>
+              <w:jc w:val="center"/>
+            </w:pPr>
+            <w:r>
+              <w:rPr>
+                <w:rFonts w:ascii="Microsoft YaHei" w:hAnsi="Microsoft YaHei" w:eastAsia="Microsoft YaHei"/>
+                <w:b w:val="0"/>
+                <w:i w:val="0"/>
+                <w:color w:val="64748B"/>
+                <w:sz w:val="16"/>
+              </w:rPr>
+              <w:t>GitHub：https://github.com/lijiale-embed</w:t>
+            </w:r>
+          </w:p>
+          <w:p>
+            <w:pPr>
+              <w:spacing w:after="24" w:line="224" w:lineRule="exact"/>
+              <w:jc w:val="center"/>
+            </w:pPr>
+            <w:r>
+              <w:rPr>
+                <w:rFonts w:ascii="Microsoft YaHei" w:hAnsi="Microsoft YaHei" w:eastAsia="Microsoft YaHei"/>
+                <w:b w:val="0"/>
+                <w:i w:val="0"/>
+                <w:color w:val="334155"/>
+                <w:sz w:val="16"/>
+              </w:rPr>
+              <w:t>上海  |  每周 5 天，6 个月及以上</w:t>
+            </w:r>
+          </w:p>
+        </w:tc>
+        <w:tc>
+          <w:tcPr>
+            <w:tcW w:type="dxa" w:w="1531"/>
+            <w:vAlign w:val="center"/>
+            <w:tcMar>
+              <w:top w:w="0" w:type="dxa"/>
+              <w:bottom w:w="0" w:type="dxa"/>
+              <w:left w:w="0" w:type="dxa"/>
+              <w:right w:w="0" w:type="dxa"/>
+            </w:tcMar>
+          </w:tcPr>
+          <w:p>
+            <w:pPr>
+              <w:spacing w:after="0"/>
+              <w:jc w:val="right"/>
+            </w:pPr>
+            <w:r>
+              <w:drawing>
+                <wp:inline xmlns:a="http://schemas.openxmlformats.org/drawingml/2006/main" xmlns:pic="http://schemas.openxmlformats.org/drawingml/2006/picture">
+                  <wp:extent cx="837000" cy="1116000"/>
+                  <wp:docPr id="1" name="Picture 1"/>
+                  <wp:cNvGraphicFramePr>
+                    <a:graphicFrameLocks noChangeAspect="1"/>
+                  </wp:cNvGraphicFramePr>
+                  <a:graphic>
+                    <a:graphicData uri="http://schemas.openxmlformats.org/drawingml/2006/picture">
+                      <pic:pic>
+                        <pic:nvPicPr>
+                          <pic:cNvPr id="0" name="portrait.jpeg"/>
+                          <pic:cNvPicPr/>
+                        </pic:nvPicPr>
+                        <pic:blipFill>
+                          <a:blip r:embed="rId9"/>
+                          <a:stretch>
+                            <a:fillRect/>
+                          </a:stretch>
+                        </pic:blipFill>
+                        <pic:spPr>
+                          <a:xfrm>
+                            <a:off x="0" y="0"/>
+                            <a:ext cx="837000" cy="1116000"/>
+                          </a:xfrm>
+                          <a:prstGeom prst="rect"/>
+                        </pic:spPr>
+                      </pic:pic>
+                    </a:graphicData>
+                  </a:graphic>
+                </wp:inline>
+              </w:drawing>
+            </w:r>
+          </w:p>
+        </w:tc>
+      </w:tr>
+    </w:tbl>
     <w:p>
       <w:pPr>
-        <w:pStyle w:val="Title"/>
+        <w:keepNext/>
         <w:widowControl/>
-        <w:spacing w:before="0" w:after="40" w:line="250" w:lineRule="auto"/>
+        <w:spacing w:before="60" w:after="40" w:line="284" w:lineRule="exact"/>
+        <w:pBdr>
+          <w:bottom w:val="single" w:sz="5" w:space="3" w:color="C2410C"/>
+        </w:pBdr>
       </w:pPr>
       <w:r>
         <w:rPr>
           <w:rFonts w:ascii="Microsoft YaHei" w:hAnsi="Microsoft YaHei" w:eastAsia="Microsoft YaHei"/>
           <w:b/>
-          <w:color w:val="202C32"/>
-          <w:sz w:val="46"/>
+          <w:i w:val="0"/>
+          <w:color w:val="C2410C"/>
+          <w:sz w:val="21"/>
         </w:rPr>
-        <w:t>李佳乐</w:t>
+        <w:t>岗位匹配优势（Python 自动化与工程测试）</w:t>
       </w:r>
     </w:p>
     <w:p>
       <w:pPr>
         <w:widowControl/>
-        <w:spacing w:before="0" w:after="40" w:line="250" w:lineRule="auto"/>
+        <w:spacing w:before="0" w:after="24" w:line="264" w:lineRule="exact"/>
+        <w:ind w:left="113" w:hanging="113"/>
+      </w:pPr>
+      <w:r>
+        <w:rPr>
+          <w:rFonts w:ascii="Microsoft YaHei" w:hAnsi="Microsoft YaHei" w:eastAsia="Microsoft YaHei"/>
+          <w:b w:val="0"/>
+          <w:i w:val="0"/>
+          <w:color w:val="334155"/>
+          <w:sz w:val="17"/>
+        </w:rPr>
+        <w:t xml:space="preserve">• </w:t>
+      </w:r>
+      <w:r>
+        <w:rPr>
+          <w:rFonts w:ascii="Microsoft YaHei" w:hAnsi="Microsoft YaHei" w:eastAsia="Microsoft YaHei"/>
+          <w:b/>
+          <w:i w:val="0"/>
+          <w:color w:val="0F172A"/>
+          <w:sz w:val="17"/>
+        </w:rPr>
+        <w:t>自动化开发：</w:t>
+      </w:r>
+      <w:r>
+        <w:rPr>
+          <w:rFonts w:ascii="Microsoft YaHei" w:hAnsi="Microsoft YaHei" w:eastAsia="Microsoft YaHei"/>
+          <w:b w:val="0"/>
+          <w:i w:val="0"/>
+          <w:color w:val="334155"/>
+          <w:sz w:val="17"/>
+        </w:rPr>
+        <w:t>具备 Python 串口回归测试经验，并完成 Excel 运营日报与 Playwright 网页录入两个个人模拟项目，关注业务规则、日志和异常处理。</w:t>
+      </w:r>
+    </w:p>
+    <w:p>
+      <w:pPr>
+        <w:widowControl/>
+        <w:spacing w:before="0" w:after="24" w:line="264" w:lineRule="exact"/>
+        <w:ind w:left="113" w:hanging="113"/>
+      </w:pPr>
+      <w:r>
+        <w:rPr>
+          <w:rFonts w:ascii="Microsoft YaHei" w:hAnsi="Microsoft YaHei" w:eastAsia="Microsoft YaHei"/>
+          <w:b w:val="0"/>
+          <w:i w:val="0"/>
+          <w:color w:val="334155"/>
+          <w:sz w:val="17"/>
+        </w:rPr>
+        <w:t xml:space="preserve">• </w:t>
+      </w:r>
+      <w:r>
+        <w:rPr>
+          <w:rFonts w:ascii="Microsoft YaHei" w:hAnsi="Microsoft YaHei" w:eastAsia="Microsoft YaHei"/>
+          <w:b/>
+          <w:i w:val="0"/>
+          <w:color w:val="0F172A"/>
+          <w:sz w:val="17"/>
+        </w:rPr>
+        <w:t>测试与工程背景：</w:t>
+      </w:r>
+      <w:r>
+        <w:rPr>
+          <w:rFonts w:ascii="Microsoft YaHei" w:hAnsi="Microsoft YaHei" w:eastAsia="Microsoft YaHei"/>
+          <w:b w:val="0"/>
+          <w:i w:val="0"/>
+          <w:color w:val="334155"/>
+          <w:sz w:val="17"/>
+        </w:rPr>
+        <w:t>保留 STM32 / ESP32、FreeRTOS、PCB 与仪器调试实践，能结合代码、接口和软硬件现象定位问题。</w:t>
+      </w:r>
+    </w:p>
+    <w:p>
+      <w:pPr>
+        <w:keepNext/>
+        <w:widowControl/>
+        <w:spacing w:before="60" w:after="40" w:line="284" w:lineRule="exact"/>
+        <w:pBdr>
+          <w:bottom w:val="single" w:sz="5" w:space="3" w:color="C2410C"/>
+        </w:pBdr>
       </w:pPr>
       <w:r>
         <w:rPr>
           <w:rFonts w:ascii="Microsoft YaHei" w:hAnsi="Microsoft YaHei" w:eastAsia="Microsoft YaHei"/>
           <w:b/>
-          <w:color w:val="202C32"/>
-          <w:sz w:val="20"/>
-        </w:rPr>
-        <w:t>求职意向：beU RPA 自动化开发实习生　|　电子信息硕士在读</w:t>
-      </w:r>
-    </w:p>
-    <w:p>
-      <w:pPr>
-        <w:widowControl/>
-        <w:spacing w:before="0" w:after="20" w:line="250" w:lineRule="auto"/>
-      </w:pPr>
-      <w:r>
-        <w:rPr>
-          <w:rFonts w:ascii="Microsoft YaHei" w:hAnsi="Microsoft YaHei" w:eastAsia="Microsoft YaHei"/>
-          <w:b w:val="0"/>
-          <w:color w:val="202C32"/>
-          <w:sz w:val="18"/>
-        </w:rPr>
-        <w:t>178-5411-9096　|　17854119096@163.com　|　上海　|　每周 5 天，6 个月及以上</w:t>
-      </w:r>
-    </w:p>
-    <w:p>
-      <w:pPr>
-        <w:widowControl/>
-        <w:spacing w:before="0" w:after="60" w:line="250" w:lineRule="auto"/>
-      </w:pPr>
-      <w:r>
-        <w:rPr>
-          <w:rFonts w:ascii="Microsoft YaHei" w:hAnsi="Microsoft YaHei" w:eastAsia="Microsoft YaHei"/>
-          <w:b w:val="0"/>
-          <w:color w:val="202C32"/>
-          <w:sz w:val="18"/>
-        </w:rPr>
-        <w:t>作品集：https://lijiale-embed.github.io/　 GitHub：https://github.com/lijiale-embed</w:t>
-      </w:r>
-    </w:p>
-    <w:p>
-      <w:pPr>
-        <w:pStyle w:val="Heading1"/>
-        <w:keepNext/>
-        <w:widowControl/>
-        <w:spacing w:before="80" w:after="40" w:line="250" w:lineRule="auto"/>
-      </w:pPr>
-      <w:r>
-        <w:rPr>
-          <w:rFonts w:ascii="Microsoft YaHei" w:hAnsi="Microsoft YaHei" w:eastAsia="Microsoft YaHei"/>
-          <w:b/>
-          <w:color w:val="202C32"/>
-          <w:sz w:val="22"/>
+          <w:i w:val="0"/>
+          <w:color w:val="C2410C"/>
+          <w:sz w:val="21"/>
         </w:rPr>
         <w:t>教育背景</w:t>
       </w:r>
@@ -83,87 +294,594 @@
     <w:p>
       <w:pPr>
         <w:keepNext/>
-        <w:tabs>
-          <w:tab w:pos="10261" w:val="right"/>
-        </w:tabs>
-        <w:spacing w:before="20" w:after="20" w:line="259" w:lineRule="auto"/>
+        <w:widowControl/>
+        <w:spacing w:before="20" w:after="20" w:line="240" w:lineRule="exact"/>
       </w:pPr>
       <w:r>
         <w:rPr>
           <w:rFonts w:ascii="Microsoft YaHei" w:hAnsi="Microsoft YaHei" w:eastAsia="Microsoft YaHei"/>
           <w:b/>
-          <w:color w:val="202C32"/>
-          <w:sz w:val="19"/>
+          <w:i w:val="0"/>
+          <w:color w:val="0F172A"/>
+          <w:sz w:val="17"/>
         </w:rPr>
-        <w:t>上海应用技术大学　电子信息 · 硕士在读</w:t>
+        <w:t>上海应用技术大学</w:t>
       </w:r>
       <w:r>
         <w:rPr>
           <w:rFonts w:ascii="Microsoft YaHei" w:hAnsi="Microsoft YaHei" w:eastAsia="Microsoft YaHei"/>
           <w:b w:val="0"/>
-          <w:color w:val="202C32"/>
-          <w:sz w:val="18"/>
+          <w:i w:val="0"/>
+          <w:color w:val="64748B"/>
+          <w:sz w:val="17"/>
         </w:rPr>
-        <w:tab/>
-        <w:t>2025.09—2028.06</w:t>
+        <w:t xml:space="preserve">  |  电子信息（硕士在读）  </w:t>
+      </w:r>
+      <w:r>
+        <w:rPr>
+          <w:rFonts w:ascii="Microsoft YaHei" w:hAnsi="Microsoft YaHei" w:eastAsia="Microsoft YaHei"/>
+          <w:b w:val="0"/>
+          <w:i/>
+          <w:color w:val="64748B"/>
+          <w:sz w:val="16"/>
+        </w:rPr>
+        <w:t>2025.09 - 2028.06</w:t>
+      </w:r>
+    </w:p>
+    <w:p>
+      <w:pPr>
+        <w:widowControl/>
+        <w:spacing w:before="0" w:after="24" w:line="264" w:lineRule="exact"/>
+        <w:ind w:left="113" w:hanging="113"/>
+      </w:pPr>
+      <w:r>
+        <w:rPr>
+          <w:rFonts w:ascii="Microsoft YaHei" w:hAnsi="Microsoft YaHei" w:eastAsia="Microsoft YaHei"/>
+          <w:b w:val="0"/>
+          <w:i w:val="0"/>
+          <w:color w:val="334155"/>
+          <w:sz w:val="17"/>
+        </w:rPr>
+        <w:t xml:space="preserve">• </w:t>
+      </w:r>
+      <w:r>
+        <w:rPr>
+          <w:rFonts w:ascii="Microsoft YaHei" w:hAnsi="Microsoft YaHei" w:eastAsia="Microsoft YaHei"/>
+          <w:b/>
+          <w:i w:val="0"/>
+          <w:color w:val="0F172A"/>
+          <w:sz w:val="17"/>
+        </w:rPr>
+        <w:t>研究方向：</w:t>
+      </w:r>
+      <w:r>
+        <w:rPr>
+          <w:rFonts w:ascii="Microsoft YaHei" w:hAnsi="Microsoft YaHei" w:eastAsia="Microsoft YaHei"/>
+          <w:b w:val="0"/>
+          <w:i w:val="0"/>
+          <w:color w:val="334155"/>
+          <w:sz w:val="17"/>
+        </w:rPr>
+        <w:t>高温超导微波器件与高频信号传输；ADS、HFSS、Sonnet 电磁仿真，MATLAB 数据处理。</w:t>
       </w:r>
     </w:p>
     <w:p>
       <w:pPr>
         <w:keepNext/>
-        <w:tabs>
-          <w:tab w:pos="10261" w:val="right"/>
-        </w:tabs>
-        <w:spacing w:before="20" w:after="20" w:line="259" w:lineRule="auto"/>
+        <w:widowControl/>
+        <w:spacing w:before="20" w:after="20" w:line="240" w:lineRule="exact"/>
       </w:pPr>
       <w:r>
         <w:rPr>
           <w:rFonts w:ascii="Microsoft YaHei" w:hAnsi="Microsoft YaHei" w:eastAsia="Microsoft YaHei"/>
           <w:b/>
-          <w:color w:val="202C32"/>
-          <w:sz w:val="19"/>
+          <w:i w:val="0"/>
+          <w:color w:val="0F172A"/>
+          <w:sz w:val="17"/>
         </w:rPr>
-        <w:t>山东青年政治学院　电子信息工程 · 本科</w:t>
+        <w:t>山东青年政治学院</w:t>
       </w:r>
       <w:r>
         <w:rPr>
           <w:rFonts w:ascii="Microsoft YaHei" w:hAnsi="Microsoft YaHei" w:eastAsia="Microsoft YaHei"/>
           <w:b w:val="0"/>
-          <w:color w:val="202C32"/>
-          <w:sz w:val="18"/>
+          <w:i w:val="0"/>
+          <w:color w:val="64748B"/>
+          <w:sz w:val="17"/>
         </w:rPr>
-        <w:tab/>
-        <w:t>2021.09—2025.06</w:t>
+        <w:t xml:space="preserve">  |  电子信息工程（本科）  </w:t>
+      </w:r>
+      <w:r>
+        <w:rPr>
+          <w:rFonts w:ascii="Microsoft YaHei" w:hAnsi="Microsoft YaHei" w:eastAsia="Microsoft YaHei"/>
+          <w:b w:val="0"/>
+          <w:i/>
+          <w:color w:val="64748B"/>
+          <w:sz w:val="16"/>
+        </w:rPr>
+        <w:t>2021.09 - 2025.06</w:t>
       </w:r>
     </w:p>
     <w:p>
       <w:pPr>
         <w:widowControl/>
-        <w:spacing w:before="0" w:after="20" w:line="250" w:lineRule="auto"/>
+        <w:spacing w:before="0" w:after="24" w:line="264" w:lineRule="exact"/>
+        <w:ind w:left="113" w:hanging="113"/>
       </w:pPr>
       <w:r>
         <w:rPr>
           <w:rFonts w:ascii="Microsoft YaHei" w:hAnsi="Microsoft YaHei" w:eastAsia="Microsoft YaHei"/>
           <w:b w:val="0"/>
-          <w:color w:val="202C32"/>
-          <w:sz w:val="18"/>
+          <w:i w:val="0"/>
+          <w:color w:val="334155"/>
+          <w:sz w:val="17"/>
         </w:rPr>
-        <w:t>硕士方向：高温超导微波器件与高频信号传输；本科专业成绩排名前 5%。</w:t>
+        <w:t xml:space="preserve">• </w:t>
+      </w:r>
+      <w:r>
+        <w:rPr>
+          <w:rFonts w:ascii="Microsoft YaHei" w:hAnsi="Microsoft YaHei" w:eastAsia="Microsoft YaHei"/>
+          <w:b/>
+          <w:i w:val="0"/>
+          <w:color w:val="0F172A"/>
+          <w:sz w:val="17"/>
+        </w:rPr>
+        <w:t>学业表现：</w:t>
+      </w:r>
+      <w:r>
+        <w:rPr>
+          <w:rFonts w:ascii="Microsoft YaHei" w:hAnsi="Microsoft YaHei" w:eastAsia="Microsoft YaHei"/>
+          <w:b w:val="0"/>
+          <w:i w:val="0"/>
+          <w:color w:val="334155"/>
+          <w:sz w:val="17"/>
+        </w:rPr>
+        <w:t>专业成绩排名前 5%；主修 C 语言程序设计、操作系统、信号与系统、单片机原理等。</w:t>
       </w:r>
     </w:p>
     <w:p>
       <w:pPr>
-        <w:pStyle w:val="Heading1"/>
         <w:keepNext/>
         <w:widowControl/>
-        <w:spacing w:before="80" w:after="40" w:line="250" w:lineRule="auto"/>
+        <w:spacing w:before="60" w:after="40" w:line="284" w:lineRule="exact"/>
+        <w:pBdr>
+          <w:bottom w:val="single" w:sz="5" w:space="3" w:color="C2410C"/>
+        </w:pBdr>
       </w:pPr>
       <w:r>
         <w:rPr>
           <w:rFonts w:ascii="Microsoft YaHei" w:hAnsi="Microsoft YaHei" w:eastAsia="Microsoft YaHei"/>
           <w:b/>
-          <w:color w:val="202C32"/>
-          <w:sz w:val="22"/>
+          <w:i w:val="0"/>
+          <w:color w:val="C2410C"/>
+          <w:sz w:val="21"/>
+        </w:rPr>
+        <w:t>项目经历（业务自动化与嵌入式工程）</w:t>
+      </w:r>
+    </w:p>
+    <w:p>
+      <w:pPr>
+        <w:keepNext/>
+        <w:widowControl/>
+        <w:spacing w:before="20" w:after="20" w:line="240" w:lineRule="exact"/>
+      </w:pPr>
+      <w:r>
+        <w:rPr>
+          <w:rFonts w:ascii="Microsoft YaHei" w:hAnsi="Microsoft YaHei" w:eastAsia="Microsoft YaHei"/>
+          <w:b/>
+          <w:i w:val="0"/>
+          <w:color w:val="0F172A"/>
+          <w:sz w:val="17"/>
+        </w:rPr>
+        <w:t>电商运营日报自动化与库存预警</w:t>
+      </w:r>
+      <w:r>
+        <w:rPr>
+          <w:rFonts w:ascii="Microsoft YaHei" w:hAnsi="Microsoft YaHei" w:eastAsia="Microsoft YaHei"/>
+          <w:b w:val="0"/>
+          <w:i w:val="0"/>
+          <w:color w:val="64748B"/>
+          <w:sz w:val="17"/>
+        </w:rPr>
+        <w:t xml:space="preserve">  |  个人模拟业务项目  </w:t>
+      </w:r>
+      <w:r>
+        <w:rPr>
+          <w:rFonts w:ascii="Microsoft YaHei" w:hAnsi="Microsoft YaHei" w:eastAsia="Microsoft YaHei"/>
+          <w:b w:val="0"/>
+          <w:i/>
+          <w:color w:val="64748B"/>
+          <w:sz w:val="16"/>
+        </w:rPr>
+        <w:t>2026.10</w:t>
+      </w:r>
+    </w:p>
+    <w:p>
+      <w:pPr>
+        <w:widowControl/>
+        <w:spacing w:before="0" w:after="24" w:line="264" w:lineRule="exact"/>
+        <w:ind w:left="113" w:hanging="113"/>
+      </w:pPr>
+      <w:r>
+        <w:rPr>
+          <w:rFonts w:ascii="Microsoft YaHei" w:hAnsi="Microsoft YaHei" w:eastAsia="Microsoft YaHei"/>
+          <w:b w:val="0"/>
+          <w:i w:val="0"/>
+          <w:color w:val="334155"/>
+          <w:sz w:val="17"/>
+        </w:rPr>
+        <w:t xml:space="preserve">• </w:t>
+      </w:r>
+      <w:r>
+        <w:rPr>
+          <w:rFonts w:ascii="Microsoft YaHei" w:hAnsi="Microsoft YaHei" w:eastAsia="Microsoft YaHei"/>
+          <w:b/>
+          <w:i w:val="0"/>
+          <w:color w:val="0F172A"/>
+          <w:sz w:val="17"/>
+        </w:rPr>
+        <w:t>流程与校验：</w:t>
+      </w:r>
+      <w:r>
+        <w:rPr>
+          <w:rFonts w:ascii="Microsoft YaHei" w:hAnsi="Microsoft YaHei" w:eastAsia="Microsoft YaHei"/>
+          <w:b w:val="0"/>
+          <w:i w:val="0"/>
+          <w:color w:val="334155"/>
+          <w:sz w:val="17"/>
+        </w:rPr>
+        <w:t>Python、pandas、openpyxl 汇总 CSV / Excel，完成订单去重、金额校验、退款与销量统计、库存预警，生成四页签日报、异常清单与日志。</w:t>
+      </w:r>
+    </w:p>
+    <w:p>
+      <w:pPr>
+        <w:widowControl/>
+        <w:spacing w:before="0" w:after="24" w:line="264" w:lineRule="exact"/>
+        <w:ind w:left="113" w:hanging="113"/>
+      </w:pPr>
+      <w:r>
+        <w:rPr>
+          <w:rFonts w:ascii="Microsoft YaHei" w:hAnsi="Microsoft YaHei" w:eastAsia="Microsoft YaHei"/>
+          <w:b w:val="0"/>
+          <w:i w:val="0"/>
+          <w:color w:val="334155"/>
+          <w:sz w:val="17"/>
+        </w:rPr>
+        <w:t xml:space="preserve">• </w:t>
+      </w:r>
+      <w:r>
+        <w:rPr>
+          <w:rFonts w:ascii="Microsoft YaHei" w:hAnsi="Microsoft YaHei" w:eastAsia="Microsoft YaHei"/>
+          <w:b/>
+          <w:i w:val="0"/>
+          <w:color w:val="0F172A"/>
+          <w:sz w:val="17"/>
+        </w:rPr>
+        <w:t>样例验证：</w:t>
+      </w:r>
+      <w:r>
+        <w:rPr>
+          <w:rFonts w:ascii="Microsoft YaHei" w:hAnsi="Microsoft YaHei" w:eastAsia="Microsoft YaHei"/>
+          <w:b w:val="0"/>
+          <w:i w:val="0"/>
+          <w:color w:val="334155"/>
+          <w:sz w:val="17"/>
+        </w:rPr>
+        <w:t>17 行订单识别 12 条异常、3 个低库存商品；11/11 项预设指标一致，覆盖冲突数据、缺列及重复执行。</w:t>
+      </w:r>
+    </w:p>
+    <w:p>
+      <w:pPr>
+        <w:keepNext/>
+        <w:widowControl/>
+        <w:spacing w:before="20" w:after="20" w:line="240" w:lineRule="exact"/>
+      </w:pPr>
+      <w:r>
+        <w:rPr>
+          <w:rFonts w:ascii="Microsoft YaHei" w:hAnsi="Microsoft YaHei" w:eastAsia="Microsoft YaHei"/>
+          <w:b/>
+          <w:i w:val="0"/>
+          <w:color w:val="0F172A"/>
+          <w:sz w:val="17"/>
+        </w:rPr>
+        <w:t>电商商品批量录入与校验机器人</w:t>
+      </w:r>
+      <w:r>
+        <w:rPr>
+          <w:rFonts w:ascii="Microsoft YaHei" w:hAnsi="Microsoft YaHei" w:eastAsia="Microsoft YaHei"/>
+          <w:b w:val="0"/>
+          <w:i w:val="0"/>
+          <w:color w:val="64748B"/>
+          <w:sz w:val="17"/>
+        </w:rPr>
+        <w:t xml:space="preserve">  |  个人模拟业务项目  </w:t>
+      </w:r>
+      <w:r>
+        <w:rPr>
+          <w:rFonts w:ascii="Microsoft YaHei" w:hAnsi="Microsoft YaHei" w:eastAsia="Microsoft YaHei"/>
+          <w:b w:val="0"/>
+          <w:i/>
+          <w:color w:val="64748B"/>
+          <w:sz w:val="16"/>
+        </w:rPr>
+        <w:t>2026.10</w:t>
+      </w:r>
+    </w:p>
+    <w:p>
+      <w:pPr>
+        <w:widowControl/>
+        <w:spacing w:before="0" w:after="24" w:line="264" w:lineRule="exact"/>
+        <w:ind w:left="113" w:hanging="113"/>
+      </w:pPr>
+      <w:r>
+        <w:rPr>
+          <w:rFonts w:ascii="Microsoft YaHei" w:hAnsi="Microsoft YaHei" w:eastAsia="Microsoft YaHei"/>
+          <w:b w:val="0"/>
+          <w:i w:val="0"/>
+          <w:color w:val="334155"/>
+          <w:sz w:val="17"/>
+        </w:rPr>
+        <w:t xml:space="preserve">• </w:t>
+      </w:r>
+      <w:r>
+        <w:rPr>
+          <w:rFonts w:ascii="Microsoft YaHei" w:hAnsi="Microsoft YaHei" w:eastAsia="Microsoft YaHei"/>
+          <w:b/>
+          <w:i w:val="0"/>
+          <w:color w:val="0F172A"/>
+          <w:sz w:val="17"/>
+        </w:rPr>
+        <w:t>实现与验证：</w:t>
+      </w:r>
+      <w:r>
+        <w:rPr>
+          <w:rFonts w:ascii="Microsoft YaHei" w:hAnsi="Microsoft YaHei" w:eastAsia="Microsoft YaHei"/>
+          <w:b w:val="0"/>
+          <w:i w:val="0"/>
+          <w:color w:val="334155"/>
+          <w:sz w:val="17"/>
+        </w:rPr>
+        <w:t>Playwright 驱动 Edge 实际填写本地后台，结合 Excel 校验、SQLite 唯一 SKU、有限重试、超时截图和结果报表；10 行样例新增 3 条、拦截 3 条无效输入，重跑新增 0 条。两项自动化项目共 17 项测试通过。</w:t>
+      </w:r>
+    </w:p>
+    <w:p>
+      <w:pPr>
+        <w:keepNext/>
+        <w:widowControl/>
+        <w:spacing w:before="20" w:after="20" w:line="240" w:lineRule="exact"/>
+      </w:pPr>
+      <w:r>
+        <w:rPr>
+          <w:rFonts w:ascii="Microsoft YaHei" w:hAnsi="Microsoft YaHei" w:eastAsia="Microsoft YaHei"/>
+          <w:b/>
+          <w:i w:val="0"/>
+          <w:color w:val="0F172A"/>
+          <w:sz w:val="17"/>
+        </w:rPr>
+        <w:t>ESP32 智能环境监测系统</w:t>
+      </w:r>
+      <w:r>
+        <w:rPr>
+          <w:rFonts w:ascii="Microsoft YaHei" w:hAnsi="Microsoft YaHei" w:eastAsia="Microsoft YaHei"/>
+          <w:b w:val="0"/>
+          <w:i w:val="0"/>
+          <w:color w:val="64748B"/>
+          <w:sz w:val="17"/>
+        </w:rPr>
+        <w:t xml:space="preserve">  |  独立工程项目  </w:t>
+      </w:r>
+      <w:r>
+        <w:rPr>
+          <w:rFonts w:ascii="Microsoft YaHei" w:hAnsi="Microsoft YaHei" w:eastAsia="Microsoft YaHei"/>
+          <w:b w:val="0"/>
+          <w:i/>
+          <w:color w:val="64748B"/>
+          <w:sz w:val="16"/>
+        </w:rPr>
+        <w:t>2026.08 - 2026.09</w:t>
+      </w:r>
+    </w:p>
+    <w:p>
+      <w:pPr>
+        <w:widowControl/>
+        <w:spacing w:before="0" w:after="24" w:line="264" w:lineRule="exact"/>
+        <w:ind w:left="113" w:hanging="113"/>
+      </w:pPr>
+      <w:r>
+        <w:rPr>
+          <w:rFonts w:ascii="Microsoft YaHei" w:hAnsi="Microsoft YaHei" w:eastAsia="Microsoft YaHei"/>
+          <w:b w:val="0"/>
+          <w:i w:val="0"/>
+          <w:color w:val="334155"/>
+          <w:sz w:val="17"/>
+        </w:rPr>
+        <w:t xml:space="preserve">• </w:t>
+      </w:r>
+      <w:r>
+        <w:rPr>
+          <w:rFonts w:ascii="Microsoft YaHei" w:hAnsi="Microsoft YaHei" w:eastAsia="Microsoft YaHei"/>
+          <w:b/>
+          <w:i w:val="0"/>
+          <w:color w:val="0F172A"/>
+          <w:sz w:val="17"/>
+        </w:rPr>
+        <w:t>软件与硬件：</w:t>
+      </w:r>
+      <w:r>
+        <w:rPr>
+          <w:rFonts w:ascii="Microsoft YaHei" w:hAnsi="Microsoft YaHei" w:eastAsia="Microsoft YaHei"/>
+          <w:b w:val="0"/>
+          <w:i w:val="0"/>
+          <w:color w:val="334155"/>
+          <w:sz w:val="17"/>
+        </w:rPr>
+        <w:t>FreeRTOS 拆分采集、显示、报警任务，Queue 传递温湿度、二值信号量通知 GPIO 中断；完成 I2C 显示及扩展底板原理图、PCB 设计实践。</w:t>
+      </w:r>
+    </w:p>
+    <w:p>
+      <w:pPr>
+        <w:keepNext/>
+        <w:widowControl/>
+        <w:spacing w:before="20" w:after="20" w:line="240" w:lineRule="exact"/>
+      </w:pPr>
+      <w:r>
+        <w:rPr>
+          <w:rFonts w:ascii="Microsoft YaHei" w:hAnsi="Microsoft YaHei" w:eastAsia="Microsoft YaHei"/>
+          <w:b/>
+          <w:i w:val="0"/>
+          <w:color w:val="0F172A"/>
+          <w:sz w:val="17"/>
+        </w:rPr>
+        <w:t>STM32 智能饮品制作系统</w:t>
+      </w:r>
+      <w:r>
+        <w:rPr>
+          <w:rFonts w:ascii="Microsoft YaHei" w:hAnsi="Microsoft YaHei" w:eastAsia="Microsoft YaHei"/>
+          <w:b w:val="0"/>
+          <w:i w:val="0"/>
+          <w:color w:val="64748B"/>
+          <w:sz w:val="17"/>
+        </w:rPr>
+        <w:t xml:space="preserve">  |  本科毕业设计 · 独立完成  </w:t>
+      </w:r>
+      <w:r>
+        <w:rPr>
+          <w:rFonts w:ascii="Microsoft YaHei" w:hAnsi="Microsoft YaHei" w:eastAsia="Microsoft YaHei"/>
+          <w:b w:val="0"/>
+          <w:i/>
+          <w:color w:val="64748B"/>
+          <w:sz w:val="16"/>
+        </w:rPr>
+        <w:t>2024.09 - 2025.05</w:t>
+      </w:r>
+    </w:p>
+    <w:p>
+      <w:pPr>
+        <w:widowControl/>
+        <w:spacing w:before="0" w:after="24" w:line="264" w:lineRule="exact"/>
+        <w:ind w:left="113" w:hanging="113"/>
+      </w:pPr>
+      <w:r>
+        <w:rPr>
+          <w:rFonts w:ascii="Microsoft YaHei" w:hAnsi="Microsoft YaHei" w:eastAsia="Microsoft YaHei"/>
+          <w:b w:val="0"/>
+          <w:i w:val="0"/>
+          <w:color w:val="334155"/>
+          <w:sz w:val="17"/>
+        </w:rPr>
+        <w:t xml:space="preserve">• </w:t>
+      </w:r>
+      <w:r>
+        <w:rPr>
+          <w:rFonts w:ascii="Microsoft YaHei" w:hAnsi="Microsoft YaHei" w:eastAsia="Microsoft YaHei"/>
+          <w:b/>
+          <w:i w:val="0"/>
+          <w:color w:val="0F172A"/>
+          <w:sz w:val="17"/>
+        </w:rPr>
+        <w:t>控制与联调：</w:t>
+      </w:r>
+      <w:r>
+        <w:rPr>
+          <w:rFonts w:ascii="Microsoft YaHei" w:hAnsi="Microsoft YaHei" w:eastAsia="Microsoft YaHei"/>
+          <w:b w:val="0"/>
+          <w:i w:val="0"/>
+          <w:color w:val="334155"/>
+          <w:sz w:val="17"/>
+        </w:rPr>
+        <w:t>以 STM32F103C8T6、FreeRTOS 组织温度采集、PID 温控、PWM 电机与水泵控制，完成 TFT 显示、蓝牙通信及软硬件联调。</w:t>
+      </w:r>
+    </w:p>
+    <w:p>
+      <w:pPr>
+        <w:keepNext/>
+        <w:widowControl/>
+        <w:spacing w:before="20" w:after="20" w:line="240" w:lineRule="exact"/>
+      </w:pPr>
+      <w:r>
+        <w:rPr>
+          <w:rFonts w:ascii="Microsoft YaHei" w:hAnsi="Microsoft YaHei" w:eastAsia="Microsoft YaHei"/>
+          <w:b/>
+          <w:i w:val="0"/>
+          <w:color w:val="0F172A"/>
+          <w:sz w:val="17"/>
+        </w:rPr>
+        <w:t>智能导盲小车</w:t>
+      </w:r>
+      <w:r>
+        <w:rPr>
+          <w:rFonts w:ascii="Microsoft YaHei" w:hAnsi="Microsoft YaHei" w:eastAsia="Microsoft YaHei"/>
+          <w:b w:val="0"/>
+          <w:i w:val="0"/>
+          <w:color w:val="64748B"/>
+          <w:sz w:val="17"/>
+        </w:rPr>
+        <w:t xml:space="preserve">  |  团队项目 · 核心成员  </w:t>
+      </w:r>
+      <w:r>
+        <w:rPr>
+          <w:rFonts w:ascii="Microsoft YaHei" w:hAnsi="Microsoft YaHei" w:eastAsia="Microsoft YaHei"/>
+          <w:b w:val="0"/>
+          <w:i/>
+          <w:color w:val="64748B"/>
+          <w:sz w:val="16"/>
+        </w:rPr>
+        <w:t>2023.04 - 2023.10</w:t>
+      </w:r>
+    </w:p>
+    <w:p>
+      <w:pPr>
+        <w:widowControl/>
+        <w:spacing w:before="0" w:after="24" w:line="264" w:lineRule="exact"/>
+        <w:ind w:left="113" w:hanging="113"/>
+      </w:pPr>
+      <w:r>
+        <w:rPr>
+          <w:rFonts w:ascii="Microsoft YaHei" w:hAnsi="Microsoft YaHei" w:eastAsia="Microsoft YaHei"/>
+          <w:b w:val="0"/>
+          <w:i w:val="0"/>
+          <w:color w:val="334155"/>
+          <w:sz w:val="17"/>
+        </w:rPr>
+        <w:t xml:space="preserve">• </w:t>
+      </w:r>
+      <w:r>
+        <w:rPr>
+          <w:rFonts w:ascii="Microsoft YaHei" w:hAnsi="Microsoft YaHei" w:eastAsia="Microsoft YaHei"/>
+          <w:b/>
+          <w:i w:val="0"/>
+          <w:color w:val="0F172A"/>
+          <w:sz w:val="17"/>
+        </w:rPr>
+        <w:t>个人参与：</w:t>
+      </w:r>
+      <w:r>
+        <w:rPr>
+          <w:rFonts w:ascii="Microsoft YaHei" w:hAnsi="Microsoft YaHei" w:eastAsia="Microsoft YaHei"/>
+          <w:b w:val="0"/>
+          <w:i w:val="0"/>
+          <w:color w:val="334155"/>
+          <w:sz w:val="17"/>
+        </w:rPr>
+        <w:t>参与 STC 手持端设计、相关代码与软硬件联调，协作树莓派车端实现信息交互；为论文合著作者，CNN 与导航为团队系统成果。</w:t>
+      </w:r>
+    </w:p>
+    <w:p>
+      <w:pPr>
+        <w:keepNext/>
+        <w:widowControl/>
+        <w:spacing w:before="60" w:after="40" w:line="284" w:lineRule="exact"/>
+        <w:pBdr>
+          <w:bottom w:val="single" w:sz="5" w:space="3" w:color="C2410C"/>
+        </w:pBdr>
+      </w:pPr>
+      <w:r>
+        <w:rPr>
+          <w:rFonts w:ascii="Microsoft YaHei" w:hAnsi="Microsoft YaHei" w:eastAsia="Microsoft YaHei"/>
+          <w:b/>
+          <w:i w:val="0"/>
+          <w:color w:val="C2410C"/>
+          <w:sz w:val="21"/>
         </w:rPr>
         <w:t>实习经历</w:t>
       </w:r>
@@ -171,361 +889,167 @@
     <w:p>
       <w:pPr>
         <w:keepNext/>
-        <w:tabs>
-          <w:tab w:pos="10261" w:val="right"/>
-        </w:tabs>
-        <w:spacing w:before="20" w:after="20" w:line="259" w:lineRule="auto"/>
+        <w:widowControl/>
+        <w:spacing w:before="20" w:after="20" w:line="240" w:lineRule="exact"/>
       </w:pPr>
       <w:r>
         <w:rPr>
           <w:rFonts w:ascii="Microsoft YaHei" w:hAnsi="Microsoft YaHei" w:eastAsia="Microsoft YaHei"/>
           <w:b/>
-          <w:color w:val="202C32"/>
-          <w:sz w:val="19"/>
+          <w:i w:val="0"/>
+          <w:color w:val="0F172A"/>
+          <w:sz w:val="17"/>
         </w:rPr>
-        <w:t>青岛英谷教育科技股份有限公司｜嵌入式研发实习生</w:t>
+        <w:t>青岛英谷教育科技股份有限公司</w:t>
       </w:r>
       <w:r>
         <w:rPr>
           <w:rFonts w:ascii="Microsoft YaHei" w:hAnsi="Microsoft YaHei" w:eastAsia="Microsoft YaHei"/>
           <w:b w:val="0"/>
-          <w:color w:val="202C32"/>
-          <w:sz w:val="18"/>
+          <w:i w:val="0"/>
+          <w:color w:val="64748B"/>
+          <w:sz w:val="17"/>
         </w:rPr>
-        <w:tab/>
-        <w:t>2024.07—2025.06</w:t>
+        <w:t xml:space="preserve">  |  嵌入式研发实习生  </w:t>
+      </w:r>
+      <w:r>
+        <w:rPr>
+          <w:rFonts w:ascii="Microsoft YaHei" w:hAnsi="Microsoft YaHei" w:eastAsia="Microsoft YaHei"/>
+          <w:b w:val="0"/>
+          <w:i/>
+          <w:color w:val="64748B"/>
+          <w:sz w:val="16"/>
+        </w:rPr>
+        <w:t>2024.07 - 2025.06</w:t>
       </w:r>
     </w:p>
     <w:p>
       <w:pPr>
         <w:widowControl/>
-        <w:spacing w:before="0" w:after="20" w:line="250" w:lineRule="auto"/>
+        <w:spacing w:before="0" w:after="24" w:line="264" w:lineRule="exact"/>
         <w:ind w:left="113" w:hanging="113"/>
       </w:pPr>
       <w:r>
         <w:rPr>
           <w:rFonts w:ascii="Microsoft YaHei" w:hAnsi="Microsoft YaHei" w:eastAsia="Microsoft YaHei"/>
           <w:b w:val="0"/>
-          <w:color w:val="202C32"/>
-          <w:sz w:val="18"/>
+          <w:i w:val="0"/>
+          <w:color w:val="334155"/>
+          <w:sz w:val="17"/>
         </w:rPr>
-        <w:t>• 基于 Python 编写串口数据流回归测试脚本，单轮测试耗时由 3.5 h 降至 1.2 h；辅助错误日志解析与测试报告整理。</w:t>
+        <w:t xml:space="preserve">• </w:t>
+      </w:r>
+      <w:r>
+        <w:rPr>
+          <w:rFonts w:ascii="Microsoft YaHei" w:hAnsi="Microsoft YaHei" w:eastAsia="Microsoft YaHei"/>
+          <w:b/>
+          <w:i w:val="0"/>
+          <w:color w:val="0F172A"/>
+          <w:sz w:val="17"/>
+        </w:rPr>
+        <w:t>Python 自动化测试：</w:t>
+      </w:r>
+      <w:r>
+        <w:rPr>
+          <w:rFonts w:ascii="Microsoft YaHei" w:hAnsi="Microsoft YaHei" w:eastAsia="Microsoft YaHei"/>
+          <w:b w:val="0"/>
+          <w:i w:val="0"/>
+          <w:color w:val="334155"/>
+          <w:sz w:val="17"/>
+        </w:rPr>
+        <w:t>编写串口数据流回归测试脚本，单轮测试耗时由 3.5 h 降至 1.2 h；辅助错误日志解析与测试报告整理。</w:t>
       </w:r>
     </w:p>
     <w:p>
       <w:pPr>
         <w:widowControl/>
-        <w:spacing w:before="0" w:after="20" w:line="250" w:lineRule="auto"/>
+        <w:spacing w:before="0" w:after="24" w:line="264" w:lineRule="exact"/>
         <w:ind w:left="113" w:hanging="113"/>
       </w:pPr>
       <w:r>
         <w:rPr>
           <w:rFonts w:ascii="Microsoft YaHei" w:hAnsi="Microsoft YaHei" w:eastAsia="Microsoft YaHei"/>
           <w:b w:val="0"/>
-          <w:color w:val="202C32"/>
-          <w:sz w:val="18"/>
+          <w:i w:val="0"/>
+          <w:color w:val="334155"/>
+          <w:sz w:val="17"/>
         </w:rPr>
-        <w:t>• 使用 C 和 Keil MDK 完成 STM32 GPIO、Timer PWM、USART 中断收发及 ADC 采样等外设驱动与测试，配合示波器、逻辑分析仪定位问题。</w:t>
+        <w:t xml:space="preserve">• </w:t>
+      </w:r>
+      <w:r>
+        <w:rPr>
+          <w:rFonts w:ascii="Microsoft YaHei" w:hAnsi="Microsoft YaHei" w:eastAsia="Microsoft YaHei"/>
+          <w:b/>
+          <w:i w:val="0"/>
+          <w:color w:val="0F172A"/>
+          <w:sz w:val="17"/>
+        </w:rPr>
+        <w:t>驱动开发与调试：</w:t>
+      </w:r>
+      <w:r>
+        <w:rPr>
+          <w:rFonts w:ascii="Microsoft YaHei" w:hAnsi="Microsoft YaHei" w:eastAsia="Microsoft YaHei"/>
+          <w:b w:val="0"/>
+          <w:i w:val="0"/>
+          <w:color w:val="334155"/>
+          <w:sz w:val="17"/>
+        </w:rPr>
+        <w:t>使用 C、Keil MDK 完成 STM32 GPIO、Timer PWM、USART 中断收发、ADC 采样等驱动与测试，配合示波器、逻辑分析仪定位问题。</w:t>
       </w:r>
     </w:p>
     <w:p>
       <w:pPr>
         <w:widowControl/>
-        <w:spacing w:before="0" w:after="20" w:line="250" w:lineRule="auto"/>
+        <w:spacing w:before="0" w:after="24" w:line="264" w:lineRule="exact"/>
         <w:ind w:left="113" w:hanging="113"/>
       </w:pPr>
       <w:r>
         <w:rPr>
           <w:rFonts w:ascii="Microsoft YaHei" w:hAnsi="Microsoft YaHei" w:eastAsia="Microsoft YaHei"/>
           <w:b w:val="0"/>
-          <w:color w:val="202C32"/>
-          <w:sz w:val="18"/>
+          <w:i w:val="0"/>
+          <w:color w:val="334155"/>
+          <w:sz w:val="17"/>
         </w:rPr>
-        <w:t>• 参与智能网关模块 8 个核心 API 接口定义及模块间通信状态机设计，梳理驱动与业务层接口边界。</w:t>
+        <w:t xml:space="preserve">• </w:t>
+      </w:r>
+      <w:r>
+        <w:rPr>
+          <w:rFonts w:ascii="Microsoft YaHei" w:hAnsi="Microsoft YaHei" w:eastAsia="Microsoft YaHei"/>
+          <w:b/>
+          <w:i w:val="0"/>
+          <w:color w:val="0F172A"/>
+          <w:sz w:val="17"/>
+        </w:rPr>
+        <w:t>接口与联调协作：</w:t>
+      </w:r>
+      <w:r>
+        <w:rPr>
+          <w:rFonts w:ascii="Microsoft YaHei" w:hAnsi="Microsoft YaHei" w:eastAsia="Microsoft YaHei"/>
+          <w:b w:val="0"/>
+          <w:i w:val="0"/>
+          <w:color w:val="334155"/>
+          <w:sz w:val="17"/>
+        </w:rPr>
+        <w:t>参与智能网关模块 8 个核心 API 接口定义及模块间通信状态机设计，梳理驱动与业务层接口边界。</w:t>
       </w:r>
     </w:p>
     <w:p>
       <w:pPr>
-        <w:pStyle w:val="Heading1"/>
         <w:keepNext/>
         <w:widowControl/>
-        <w:spacing w:before="80" w:after="40" w:line="250" w:lineRule="auto"/>
+        <w:spacing w:before="60" w:after="40" w:line="284" w:lineRule="exact"/>
+        <w:pBdr>
+          <w:bottom w:val="single" w:sz="5" w:space="3" w:color="C2410C"/>
+        </w:pBdr>
       </w:pPr>
       <w:r>
         <w:rPr>
           <w:rFonts w:ascii="Microsoft YaHei" w:hAnsi="Microsoft YaHei" w:eastAsia="Microsoft YaHei"/>
           <w:b/>
-          <w:color w:val="202C32"/>
-          <w:sz w:val="22"/>
-        </w:rPr>
-        <w:t>项目经历</w:t>
-      </w:r>
-    </w:p>
-    <w:p>
-      <w:pPr>
-        <w:keepNext/>
-        <w:tabs>
-          <w:tab w:pos="10261" w:val="right"/>
-        </w:tabs>
-        <w:spacing w:before="20" w:after="20" w:line="259" w:lineRule="auto"/>
-      </w:pPr>
-      <w:r>
-        <w:rPr>
-          <w:rFonts w:ascii="Microsoft YaHei" w:hAnsi="Microsoft YaHei" w:eastAsia="Microsoft YaHei"/>
-          <w:b/>
-          <w:color w:val="202C32"/>
-          <w:sz w:val="19"/>
-        </w:rPr>
-        <w:t>电商运营日报与库存预警｜个人模拟业务项目</w:t>
-      </w:r>
-      <w:r>
-        <w:rPr>
-          <w:rFonts w:ascii="Microsoft YaHei" w:hAnsi="Microsoft YaHei" w:eastAsia="Microsoft YaHei"/>
-          <w:b w:val="0"/>
-          <w:color w:val="202C32"/>
-          <w:sz w:val="18"/>
-        </w:rPr>
-        <w:tab/>
-        <w:t>2026.10</w:t>
-      </w:r>
-    </w:p>
-    <w:p>
-      <w:pPr>
-        <w:widowControl/>
-        <w:spacing w:before="0" w:after="20" w:line="250" w:lineRule="auto"/>
-        <w:ind w:left="113" w:hanging="113"/>
-      </w:pPr>
-      <w:r>
-        <w:rPr>
-          <w:rFonts w:ascii="Microsoft YaHei" w:hAnsi="Microsoft YaHei" w:eastAsia="Microsoft YaHei"/>
-          <w:b w:val="0"/>
-          <w:color w:val="202C32"/>
-          <w:sz w:val="18"/>
-        </w:rPr>
-        <w:t>• 使用 Python、pandas、openpyxl 处理 CSV / Excel，完成订单去重、金额校验、退款汇总及低库存识别，生成四页签日报、异常清单与运行日志。</w:t>
-      </w:r>
-    </w:p>
-    <w:p>
-      <w:pPr>
-        <w:widowControl/>
-        <w:spacing w:before="0" w:after="20" w:line="250" w:lineRule="auto"/>
-        <w:ind w:left="113" w:hanging="113"/>
-      </w:pPr>
-      <w:r>
-        <w:rPr>
-          <w:rFonts w:ascii="Microsoft YaHei" w:hAnsi="Microsoft YaHei" w:eastAsia="Microsoft YaHei"/>
-          <w:b w:val="0"/>
-          <w:color w:val="202C32"/>
-          <w:sz w:val="18"/>
-        </w:rPr>
-        <w:t>• 固定样例处理 17 行订单，识别 12 条异常、3 个低库存商品；11/11 项预设指标核对一致，覆盖冲突数据、缺列失败及重复执行测试。</w:t>
-      </w:r>
-    </w:p>
-    <w:p>
-      <w:pPr>
-        <w:keepNext/>
-        <w:tabs>
-          <w:tab w:pos="10261" w:val="right"/>
-        </w:tabs>
-        <w:spacing w:before="20" w:after="20" w:line="259" w:lineRule="auto"/>
-      </w:pPr>
-      <w:r>
-        <w:rPr>
-          <w:rFonts w:ascii="Microsoft YaHei" w:hAnsi="Microsoft YaHei" w:eastAsia="Microsoft YaHei"/>
-          <w:b/>
-          <w:color w:val="202C32"/>
-          <w:sz w:val="19"/>
-        </w:rPr>
-        <w:t>电商商品批量录入机器人｜个人模拟业务项目</w:t>
-      </w:r>
-      <w:r>
-        <w:rPr>
-          <w:rFonts w:ascii="Microsoft YaHei" w:hAnsi="Microsoft YaHei" w:eastAsia="Microsoft YaHei"/>
-          <w:b w:val="0"/>
-          <w:color w:val="202C32"/>
-          <w:sz w:val="18"/>
-        </w:rPr>
-        <w:tab/>
-        <w:t>2026.10</w:t>
-      </w:r>
-    </w:p>
-    <w:p>
-      <w:pPr>
-        <w:widowControl/>
-        <w:spacing w:before="0" w:after="20" w:line="250" w:lineRule="auto"/>
-        <w:ind w:left="113" w:hanging="113"/>
-      </w:pPr>
-      <w:r>
-        <w:rPr>
-          <w:rFonts w:ascii="Microsoft YaHei" w:hAnsi="Microsoft YaHei" w:eastAsia="Microsoft YaHei"/>
-          <w:b w:val="0"/>
-          <w:color w:val="202C32"/>
-          <w:sz w:val="18"/>
-        </w:rPr>
-        <w:t>• 使用 Playwright 驱动 Edge 实际填写本地商品后台，结合 Excel 输入校验、SQLite 唯一 SKU、有限重试、超时截图与逐行执行报表。</w:t>
-      </w:r>
-    </w:p>
-    <w:p>
-      <w:pPr>
-        <w:widowControl/>
-        <w:spacing w:before="0" w:after="20" w:line="250" w:lineRule="auto"/>
-        <w:ind w:left="113" w:hanging="113"/>
-      </w:pPr>
-      <w:r>
-        <w:rPr>
-          <w:rFonts w:ascii="Microsoft YaHei" w:hAnsi="Microsoft YaHei" w:eastAsia="Microsoft YaHei"/>
-          <w:b w:val="0"/>
-          <w:color w:val="202C32"/>
-          <w:sz w:val="18"/>
-        </w:rPr>
-        <w:t>• 10 行样例新增 3 条，拦截 3 条无效输入，验证重复 SKU、故障重试与超时；重跑新增 0 条。两项自动化项目共 17 项测试通过。</w:t>
-      </w:r>
-    </w:p>
-    <w:p>
-      <w:pPr>
-        <w:keepNext/>
-        <w:tabs>
-          <w:tab w:pos="10261" w:val="right"/>
-        </w:tabs>
-        <w:spacing w:before="20" w:after="20" w:line="259" w:lineRule="auto"/>
-      </w:pPr>
-      <w:r>
-        <w:rPr>
-          <w:rFonts w:ascii="Microsoft YaHei" w:hAnsi="Microsoft YaHei" w:eastAsia="Microsoft YaHei"/>
-          <w:b/>
-          <w:color w:val="202C32"/>
-          <w:sz w:val="19"/>
-        </w:rPr>
-        <w:t>ESP32 智能环境监测系统｜独立工程项目</w:t>
-      </w:r>
-      <w:r>
-        <w:rPr>
-          <w:rFonts w:ascii="Microsoft YaHei" w:hAnsi="Microsoft YaHei" w:eastAsia="Microsoft YaHei"/>
-          <w:b w:val="0"/>
-          <w:color w:val="202C32"/>
-          <w:sz w:val="18"/>
-        </w:rPr>
-        <w:tab/>
-        <w:t>2026.08—2026.09</w:t>
-      </w:r>
-    </w:p>
-    <w:p>
-      <w:pPr>
-        <w:widowControl/>
-        <w:spacing w:before="0" w:after="20" w:line="250" w:lineRule="auto"/>
-        <w:ind w:left="113" w:hanging="113"/>
-      </w:pPr>
-      <w:r>
-        <w:rPr>
-          <w:rFonts w:ascii="Microsoft YaHei" w:hAnsi="Microsoft YaHei" w:eastAsia="Microsoft YaHei"/>
-          <w:b w:val="0"/>
-          <w:color w:val="202C32"/>
-          <w:sz w:val="18"/>
-        </w:rPr>
-        <w:t>• 使用 FreeRTOS 拆分采集、显示、报警任务；Queue 传递温湿度，二值信号量通知 GPIO 中断事件；完成 I2C 屏幕及扩展底板原理图、PCB 设计实践。</w:t>
-      </w:r>
-    </w:p>
-    <w:p>
-      <w:pPr>
-        <w:keepNext/>
-        <w:tabs>
-          <w:tab w:pos="10261" w:val="right"/>
-        </w:tabs>
-        <w:spacing w:before="20" w:after="20" w:line="259" w:lineRule="auto"/>
-      </w:pPr>
-      <w:r>
-        <w:rPr>
-          <w:rFonts w:ascii="Microsoft YaHei" w:hAnsi="Microsoft YaHei" w:eastAsia="Microsoft YaHei"/>
-          <w:b/>
-          <w:color w:val="202C32"/>
-          <w:sz w:val="19"/>
-        </w:rPr>
-        <w:t>STM32 智能饮品制作系统｜本科毕业设计 · 独立完成</w:t>
-      </w:r>
-      <w:r>
-        <w:rPr>
-          <w:rFonts w:ascii="Microsoft YaHei" w:hAnsi="Microsoft YaHei" w:eastAsia="Microsoft YaHei"/>
-          <w:b w:val="0"/>
-          <w:color w:val="202C32"/>
-          <w:sz w:val="18"/>
-        </w:rPr>
-        <w:tab/>
-        <w:t>2024.09—2025.05</w:t>
-      </w:r>
-    </w:p>
-    <w:p>
-      <w:pPr>
-        <w:widowControl/>
-        <w:spacing w:before="0" w:after="20" w:line="250" w:lineRule="auto"/>
-        <w:ind w:left="113" w:hanging="113"/>
-      </w:pPr>
-      <w:r>
-        <w:rPr>
-          <w:rFonts w:ascii="Microsoft YaHei" w:hAnsi="Microsoft YaHei" w:eastAsia="Microsoft YaHei"/>
-          <w:b w:val="0"/>
-          <w:color w:val="202C32"/>
-          <w:sz w:val="18"/>
-        </w:rPr>
-        <w:t>• 以 STM32F103C8T6、FreeRTOS 组织温度采集、PID 温控、PWM 电机与水泵控制，完成 TFT 显示、蓝牙通信及软硬件联调。</w:t>
-      </w:r>
-    </w:p>
-    <w:p>
-      <w:pPr>
-        <w:keepNext/>
-        <w:tabs>
-          <w:tab w:pos="10261" w:val="right"/>
-        </w:tabs>
-        <w:spacing w:before="20" w:after="20" w:line="259" w:lineRule="auto"/>
-      </w:pPr>
-      <w:r>
-        <w:rPr>
-          <w:rFonts w:ascii="Microsoft YaHei" w:hAnsi="Microsoft YaHei" w:eastAsia="Microsoft YaHei"/>
-          <w:b/>
-          <w:color w:val="202C32"/>
-          <w:sz w:val="19"/>
-        </w:rPr>
-        <w:t>智能导盲小车｜团队项目 · 核心成员</w:t>
-      </w:r>
-      <w:r>
-        <w:rPr>
-          <w:rFonts w:ascii="Microsoft YaHei" w:hAnsi="Microsoft YaHei" w:eastAsia="Microsoft YaHei"/>
-          <w:b w:val="0"/>
-          <w:color w:val="202C32"/>
-          <w:sz w:val="18"/>
-        </w:rPr>
-        <w:tab/>
-        <w:t>2023.04—2023.10</w:t>
-      </w:r>
-    </w:p>
-    <w:p>
-      <w:pPr>
-        <w:widowControl/>
-        <w:spacing w:before="0" w:after="20" w:line="250" w:lineRule="auto"/>
-        <w:ind w:left="113" w:hanging="113"/>
-      </w:pPr>
-      <w:r>
-        <w:rPr>
-          <w:rFonts w:ascii="Microsoft YaHei" w:hAnsi="Microsoft YaHei" w:eastAsia="Microsoft YaHei"/>
-          <w:b w:val="0"/>
-          <w:color w:val="202C32"/>
-          <w:sz w:val="18"/>
-        </w:rPr>
-        <w:t>• 参与 STC 手持端设计、相关代码与软硬件联调，协作树莓派车端实现信息交互；为导盲车论文合著作者，CNN 与导航为团队系统成果。</w:t>
-      </w:r>
-    </w:p>
-    <w:p>
-      <w:pPr>
-        <w:pStyle w:val="Heading1"/>
-        <w:keepNext/>
-        <w:widowControl/>
-        <w:spacing w:before="80" w:after="40" w:line="250" w:lineRule="auto"/>
-      </w:pPr>
-      <w:r>
-        <w:rPr>
-          <w:rFonts w:ascii="Microsoft YaHei" w:hAnsi="Microsoft YaHei" w:eastAsia="Microsoft YaHei"/>
-          <w:b/>
-          <w:color w:val="202C32"/>
-          <w:sz w:val="22"/>
+          <w:i w:val="0"/>
+          <w:color w:val="C2410C"/>
+          <w:sz w:val="21"/>
         </w:rPr>
         <w:t>专业技能与荣誉</w:t>
       </w:r>
@@ -533,66 +1057,154 @@
     <w:p>
       <w:pPr>
         <w:widowControl/>
-        <w:spacing w:before="0" w:after="40" w:line="250" w:lineRule="auto"/>
+        <w:spacing w:before="0" w:after="24" w:line="264" w:lineRule="exact"/>
+        <w:ind w:left="113" w:hanging="113"/>
       </w:pPr>
       <w:r>
         <w:rPr>
           <w:rFonts w:ascii="Microsoft YaHei" w:hAnsi="Microsoft YaHei" w:eastAsia="Microsoft YaHei"/>
           <w:b w:val="0"/>
-          <w:color w:val="202C32"/>
-          <w:sz w:val="18"/>
+          <w:i w:val="0"/>
+          <w:color w:val="334155"/>
+          <w:sz w:val="17"/>
         </w:rPr>
-        <w:t>开发与自动化：C、Python、MATLAB；C++ 基础；JavaScript / HTML / CSS 实践；pandas、openpyxl、Playwright、pytest、日志与异常处理。</w:t>
+        <w:t xml:space="preserve">• </w:t>
+      </w:r>
+      <w:r>
+        <w:rPr>
+          <w:rFonts w:ascii="Microsoft YaHei" w:hAnsi="Microsoft YaHei" w:eastAsia="Microsoft YaHei"/>
+          <w:b/>
+          <w:i w:val="0"/>
+          <w:color w:val="0F172A"/>
+          <w:sz w:val="17"/>
+        </w:rPr>
+        <w:t>编程与自动化：</w:t>
+      </w:r>
+      <w:r>
+        <w:rPr>
+          <w:rFonts w:ascii="Microsoft YaHei" w:hAnsi="Microsoft YaHei" w:eastAsia="Microsoft YaHei"/>
+          <w:b w:val="0"/>
+          <w:i w:val="0"/>
+          <w:color w:val="334155"/>
+          <w:sz w:val="17"/>
+        </w:rPr>
+        <w:t>C、Python、MATLAB、C++ 基础；JavaScript / HTML / CSS 实践；pandas、openpyxl、Playwright、pytest、日志与异常处理。</w:t>
       </w:r>
     </w:p>
     <w:p>
       <w:pPr>
         <w:widowControl/>
-        <w:spacing w:before="0" w:after="40" w:line="250" w:lineRule="auto"/>
+        <w:spacing w:before="0" w:after="24" w:line="264" w:lineRule="exact"/>
+        <w:ind w:left="113" w:hanging="113"/>
       </w:pPr>
       <w:r>
         <w:rPr>
           <w:rFonts w:ascii="Microsoft YaHei" w:hAnsi="Microsoft YaHei" w:eastAsia="Microsoft YaHei"/>
           <w:b w:val="0"/>
-          <w:color w:val="202C32"/>
-          <w:sz w:val="18"/>
+          <w:i w:val="0"/>
+          <w:color w:val="334155"/>
+          <w:sz w:val="17"/>
         </w:rPr>
-        <w:t>嵌入式与硬件：STM32、ESP32、FreeRTOS；UART / I2C / SPI / 1-Wire、GPIO / PWM / ADC；Altium Designer、嘉立创 EDA、PCB、焊接与仪器调试。</w:t>
+        <w:t xml:space="preserve">• </w:t>
+      </w:r>
+      <w:r>
+        <w:rPr>
+          <w:rFonts w:ascii="Microsoft YaHei" w:hAnsi="Microsoft YaHei" w:eastAsia="Microsoft YaHei"/>
+          <w:b/>
+          <w:i w:val="0"/>
+          <w:color w:val="0F172A"/>
+          <w:sz w:val="17"/>
+        </w:rPr>
+        <w:t>嵌入式与硬件：</w:t>
+      </w:r>
+      <w:r>
+        <w:rPr>
+          <w:rFonts w:ascii="Microsoft YaHei" w:hAnsi="Microsoft YaHei" w:eastAsia="Microsoft YaHei"/>
+          <w:b w:val="0"/>
+          <w:i w:val="0"/>
+          <w:color w:val="334155"/>
+          <w:sz w:val="17"/>
+        </w:rPr>
+        <w:t>STM32、ESP32、FreeRTOS；GPIO / PWM / ADC / EXTI、UART / I2C / SPI / 1-Wire；Altium Designer、嘉立创 EDA、双层 PCB、贴片焊接及仪器调试。</w:t>
       </w:r>
     </w:p>
     <w:p>
       <w:pPr>
         <w:widowControl/>
-        <w:spacing w:before="0" w:after="40" w:line="250" w:lineRule="auto"/>
+        <w:spacing w:before="0" w:after="24" w:line="264" w:lineRule="exact"/>
+        <w:ind w:left="113" w:hanging="113"/>
       </w:pPr>
       <w:r>
         <w:rPr>
           <w:rFonts w:ascii="Microsoft YaHei" w:hAnsi="Microsoft YaHei" w:eastAsia="Microsoft YaHei"/>
           <w:b w:val="0"/>
-          <w:color w:val="202C32"/>
-          <w:sz w:val="18"/>
+          <w:i w:val="0"/>
+          <w:color w:val="334155"/>
+          <w:sz w:val="17"/>
         </w:rPr>
-        <w:t>工具与仿真：Git、Linux 基础、Keil MDK、ST-Link、VS Code、Wokwi、ADS、HFSS、Sonnet；示波器、逻辑分析仪、万用表。</w:t>
+        <w:t xml:space="preserve">• </w:t>
+      </w:r>
+      <w:r>
+        <w:rPr>
+          <w:rFonts w:ascii="Microsoft YaHei" w:hAnsi="Microsoft YaHei" w:eastAsia="Microsoft YaHei"/>
+          <w:b/>
+          <w:i w:val="0"/>
+          <w:color w:val="0F172A"/>
+          <w:sz w:val="17"/>
+        </w:rPr>
+        <w:t>工具与仿真：</w:t>
+      </w:r>
+      <w:r>
+        <w:rPr>
+          <w:rFonts w:ascii="Microsoft YaHei" w:hAnsi="Microsoft YaHei" w:eastAsia="Microsoft YaHei"/>
+          <w:b w:val="0"/>
+          <w:i w:val="0"/>
+          <w:color w:val="334155"/>
+          <w:sz w:val="17"/>
+        </w:rPr>
+        <w:t>Git、Linux 基础、Keil MDK、ST-Link、VS Code、Wokwi、ADS、HFSS、Sonnet；示波器、逻辑分析仪、万用表。</w:t>
       </w:r>
     </w:p>
     <w:p>
       <w:pPr>
         <w:widowControl/>
-        <w:spacing w:before="0" w:after="0" w:line="250" w:lineRule="auto"/>
+        <w:spacing w:before="0" w:after="24" w:line="264" w:lineRule="exact"/>
+        <w:ind w:left="113" w:hanging="113"/>
       </w:pPr>
       <w:r>
         <w:rPr>
           <w:rFonts w:ascii="Microsoft YaHei" w:hAnsi="Microsoft YaHei" w:eastAsia="Microsoft YaHei"/>
           <w:b w:val="0"/>
-          <w:color w:val="202C32"/>
+          <w:i w:val="0"/>
+          <w:color w:val="334155"/>
           <w:sz w:val="17"/>
         </w:rPr>
-        <w:t>CET-4、计算机三级、普通话二乙；大学生数学竞赛校级一等奖、大学生科技创新大赛一等奖、校级三好学生及奖学金；合著导盲车论文 1 篇。</w:t>
+        <w:t xml:space="preserve">• </w:t>
+      </w:r>
+      <w:r>
+        <w:rPr>
+          <w:rFonts w:ascii="Microsoft YaHei" w:hAnsi="Microsoft YaHei" w:eastAsia="Microsoft YaHei"/>
+          <w:b/>
+          <w:i w:val="0"/>
+          <w:color w:val="0F172A"/>
+          <w:sz w:val="17"/>
+        </w:rPr>
+        <w:t>荣誉与成果：</w:t>
+      </w:r>
+      <w:r>
+        <w:rPr>
+          <w:rFonts w:ascii="Microsoft YaHei" w:hAnsi="Microsoft YaHei" w:eastAsia="Microsoft YaHei"/>
+          <w:b w:val="0"/>
+          <w:i w:val="0"/>
+          <w:color w:val="334155"/>
+          <w:sz w:val="17"/>
+        </w:rPr>
+        <w:t>CET-4、计算机三级、普通话二乙；大学生数学竞赛校级一等奖、科技创新大赛一等奖、校级三好学生及奖学金；合著论文 1 篇。</w:t>
       </w:r>
     </w:p>
     <w:sectPr>
       <w:pgSz w:w="11906" w:h="16838"/>
-      <w:pgMar w:top="624" w:right="794" w:bottom="624" w:left="794" w:header="720" w:footer="720" w:gutter="0"/>
+      <w:pgMar w:top="454" w:right="652" w:bottom="510" w:left="652" w:header="720" w:footer="720" w:gutter="0"/>
       <w:cols w:space="720"/>
       <w:docGrid w:linePitch="360"/>
     </w:sectPr>
@@ -964,11 +1576,11 @@
     <w:qFormat/>
     <w:rsid w:val="00FC693F"/>
     <w:pPr>
-      <w:spacing w:after="30"/>
+      <w:spacing w:after="20"/>
     </w:pPr>
     <w:rPr>
       <w:rFonts w:ascii="Microsoft YaHei" w:hAnsi="Microsoft YaHei" w:eastAsia="Microsoft YaHei"/>
-      <w:sz w:val="18"/>
+      <w:sz w:val="17"/>
     </w:rPr>
   </w:style>
   <w:style w:type="paragraph" w:styleId="Header">

</xml_diff>